<commit_message>
Added - First batch of New Artstyle plants
</commit_message>
<xml_diff>
--- a/ideas_ressources_files/animation tutorial/how_to_animate.docx
+++ b/ideas_ressources_files/animation tutorial/how_to_animate.docx
@@ -5,6 +5,7 @@
     <w:p>
       <w:pPr>
         <w:pStyle w:val="Titre"/>
+        <w:jc w:val="both"/>
       </w:pPr>
       <w:r>
         <w:t>Clip Studio Paint – Key frame Animation</w:t>
@@ -13,6 +14,7 @@
     <w:p>
       <w:pPr>
         <w:pStyle w:val="Titre1"/>
+        <w:jc w:val="both"/>
       </w:pPr>
       <w:r>
         <w:t>Set-</w:t>
@@ -24,6 +26,7 @@
     <w:p>
       <w:pPr>
         <w:pStyle w:val="Titre2"/>
+        <w:jc w:val="both"/>
       </w:pPr>
       <w:r>
         <w:rPr>
@@ -97,6 +100,9 @@
       </w:r>
     </w:p>
     <w:p>
+      <w:pPr>
+        <w:jc w:val="both"/>
+      </w:pPr>
       <w:r>
         <w:t>Turn on the timeline menu as seen in the image.</w:t>
       </w:r>
@@ -104,18 +110,22 @@
     <w:p>
       <w:pPr>
         <w:pStyle w:val="Titre2"/>
+        <w:jc w:val="both"/>
       </w:pPr>
       <w:r>
         <w:t>2 – Set Playback Options</w:t>
       </w:r>
     </w:p>
     <w:p>
+      <w:pPr>
+        <w:jc w:val="both"/>
+      </w:pPr>
       <w:r>
         <w:rPr>
           <w:noProof/>
         </w:rPr>
         <w:drawing>
-          <wp:anchor distT="0" distB="0" distL="114300" distR="114300" simplePos="0" relativeHeight="251659264" behindDoc="0" locked="0" layoutInCell="1" allowOverlap="1" wp14:anchorId="30B2E894" wp14:editId="35450950">
+          <wp:anchor distT="0" distB="0" distL="114300" distR="114300" simplePos="0" relativeHeight="251659264" behindDoc="0" locked="0" layoutInCell="1" allowOverlap="1" wp14:anchorId="30B2E894" wp14:editId="2A591E10">
             <wp:simplePos x="0" y="0"/>
             <wp:positionH relativeFrom="column">
               <wp:posOffset>2529205</wp:posOffset>
@@ -184,12 +194,16 @@
     <w:p>
       <w:pPr>
         <w:pStyle w:val="Titre2"/>
+        <w:jc w:val="both"/>
       </w:pPr>
       <w:r>
         <w:t>3 – Check frame rate</w:t>
       </w:r>
     </w:p>
     <w:p>
+      <w:pPr>
+        <w:jc w:val="both"/>
+      </w:pPr>
       <w:r>
         <w:rPr>
           <w:noProof/>
@@ -269,12 +283,16 @@
     <w:p>
       <w:pPr>
         <w:pStyle w:val="Titre2"/>
+        <w:jc w:val="both"/>
       </w:pPr>
       <w:r>
         <w:t>4 – Duplicate blank template</w:t>
       </w:r>
     </w:p>
     <w:p>
+      <w:pPr>
+        <w:jc w:val="both"/>
+      </w:pPr>
       <w:r>
         <w:t xml:space="preserve">If the art department did their job correctly, once in the “Manage timeline” menu you should see a </w:t>
       </w:r>
@@ -283,13 +301,41 @@
           <w:i/>
           <w:iCs/>
         </w:rPr>
-        <w:t>Blank With PivotPoints</w:t>
-      </w:r>
+        <w:t xml:space="preserve">Blank </w:t>
+      </w:r>
+      <w:proofErr w:type="gramStart"/>
+      <w:r>
+        <w:rPr>
+          <w:i/>
+          <w:iCs/>
+        </w:rPr>
+        <w:t>With</w:t>
+      </w:r>
+      <w:proofErr w:type="gramEnd"/>
+      <w:r>
+        <w:rPr>
+          <w:i/>
+          <w:iCs/>
+        </w:rPr>
+        <w:t xml:space="preserve"> </w:t>
+      </w:r>
+      <w:proofErr w:type="spellStart"/>
+      <w:r>
+        <w:rPr>
+          <w:i/>
+          <w:iCs/>
+        </w:rPr>
+        <w:t>PivotPoints</w:t>
+      </w:r>
+      <w:proofErr w:type="spellEnd"/>
       <w:r>
         <w:t xml:space="preserve"> timeline. Duplicate it.</w:t>
       </w:r>
     </w:p>
     <w:p>
+      <w:pPr>
+        <w:jc w:val="both"/>
+      </w:pPr>
       <w:r>
         <w:rPr>
           <w:noProof/>
@@ -363,10 +409,21 @@
         </w:drawing>
       </w:r>
       <w:r>
-        <w:t>This timeline already has keyframes on frames 1 and 24, and the relevant layer’s pivot points have already been set-up.</w:t>
-      </w:r>
-    </w:p>
-    <w:p>
+        <w:t xml:space="preserve">This timeline already has </w:t>
+      </w:r>
+      <w:proofErr w:type="gramStart"/>
+      <w:r>
+        <w:t>keyframes</w:t>
+      </w:r>
+      <w:proofErr w:type="gramEnd"/>
+      <w:r>
+        <w:t xml:space="preserve"> on frames 1 and 24, and the relevant layer’s pivot points have already been set-up.</w:t>
+      </w:r>
+    </w:p>
+    <w:p>
+      <w:pPr>
+        <w:jc w:val="both"/>
+      </w:pPr>
       <w:r>
         <w:t xml:space="preserve">If the </w:t>
       </w:r>
@@ -375,13 +432,41 @@
           <w:i/>
           <w:iCs/>
         </w:rPr>
-        <w:t>Blank With PivotPoints</w:t>
-      </w:r>
+        <w:t xml:space="preserve">Blank </w:t>
+      </w:r>
+      <w:proofErr w:type="gramStart"/>
+      <w:r>
+        <w:rPr>
+          <w:i/>
+          <w:iCs/>
+        </w:rPr>
+        <w:t>With</w:t>
+      </w:r>
+      <w:proofErr w:type="gramEnd"/>
+      <w:r>
+        <w:rPr>
+          <w:i/>
+          <w:iCs/>
+        </w:rPr>
+        <w:t xml:space="preserve"> </w:t>
+      </w:r>
+      <w:proofErr w:type="spellStart"/>
+      <w:r>
+        <w:rPr>
+          <w:i/>
+          <w:iCs/>
+        </w:rPr>
+        <w:t>PivotPoints</w:t>
+      </w:r>
+      <w:proofErr w:type="spellEnd"/>
       <w:r>
         <w:t xml:space="preserve"> template is missing, follow the guide at the end of this document to see how to create one.</w:t>
       </w:r>
     </w:p>
     <w:p>
+      <w:pPr>
+        <w:jc w:val="both"/>
+      </w:pPr>
       <w:r>
         <w:t xml:space="preserve">If you are animating a sprite that uses duplicate animations from an already completed </w:t>
       </w:r>
@@ -392,6 +477,7 @@
     <w:p>
       <w:pPr>
         <w:pStyle w:val="Titre1"/>
+        <w:jc w:val="both"/>
       </w:pPr>
       <w:r>
         <w:rPr>
@@ -467,27 +553,40 @@
     <w:p>
       <w:pPr>
         <w:pStyle w:val="Titre2"/>
+        <w:jc w:val="both"/>
       </w:pPr>
       <w:r>
         <w:t>1 – Timeline manipulation</w:t>
       </w:r>
     </w:p>
     <w:p>
+      <w:pPr>
+        <w:jc w:val="both"/>
+      </w:pPr>
       <w:r>
         <w:t>In order to animate using keyframes, keyframe animation must be active. To do so, select every folder and click on the left-most button of the green rectangle in the middle of the image above.</w:t>
       </w:r>
     </w:p>
     <w:p>
+      <w:pPr>
+        <w:jc w:val="both"/>
+      </w:pPr>
       <w:r>
         <w:t>If done correctly, the keyframes should now be visible.</w:t>
       </w:r>
     </w:p>
     <w:p>
+      <w:pPr>
+        <w:jc w:val="both"/>
+      </w:pPr>
       <w:r>
         <w:t>To manipulate objects in this state, you must be in object mode (light blue rectangle on the left). This will enable the blue outline and anchor points for object manipulation (size and translation).</w:t>
       </w:r>
     </w:p>
     <w:p>
+      <w:pPr>
+        <w:jc w:val="both"/>
+      </w:pPr>
       <w:r>
         <w:t xml:space="preserve">The pivot point is also visible in this state (dark blue rectangle in the middle of the canvas). It should not be touched, as it will mess it the centre of rotation and it does not carry through canvases. That is why it is already set up by the </w:t>
       </w:r>
@@ -496,13 +595,41 @@
           <w:i/>
           <w:iCs/>
         </w:rPr>
-        <w:t>Blank With PivotPoints</w:t>
-      </w:r>
+        <w:t xml:space="preserve">Blank </w:t>
+      </w:r>
+      <w:proofErr w:type="gramStart"/>
+      <w:r>
+        <w:rPr>
+          <w:i/>
+          <w:iCs/>
+        </w:rPr>
+        <w:t>With</w:t>
+      </w:r>
+      <w:proofErr w:type="gramEnd"/>
+      <w:r>
+        <w:rPr>
+          <w:i/>
+          <w:iCs/>
+        </w:rPr>
+        <w:t xml:space="preserve"> </w:t>
+      </w:r>
+      <w:proofErr w:type="spellStart"/>
+      <w:r>
+        <w:rPr>
+          <w:i/>
+          <w:iCs/>
+        </w:rPr>
+        <w:t>PivotPoints</w:t>
+      </w:r>
+      <w:proofErr w:type="spellEnd"/>
       <w:r>
         <w:t xml:space="preserve"> timeline.</w:t>
       </w:r>
     </w:p>
     <w:p>
+      <w:pPr>
+        <w:jc w:val="both"/>
+      </w:pPr>
       <w:r>
         <w:t>You can collapse the timeline menu using the little arrows on the bottom left (yellow rectangle).</w:t>
       </w:r>
@@ -510,34 +637,59 @@
     <w:p>
       <w:pPr>
         <w:pStyle w:val="Titre2"/>
+        <w:jc w:val="both"/>
       </w:pPr>
       <w:r>
         <w:t>2 – Folders and Layers</w:t>
       </w:r>
     </w:p>
     <w:p>
+      <w:pPr>
+        <w:jc w:val="both"/>
+      </w:pPr>
       <w:r>
         <w:t>While animating, you will only be using folders, not layers. In fact, all folders with no folders inside might as well be collapsed.</w:t>
       </w:r>
     </w:p>
     <w:p>
+      <w:pPr>
+        <w:jc w:val="both"/>
+      </w:pPr>
       <w:r>
         <w:t>Folders marked in red shouldn’t be used during animation, they too can be collapsed.</w:t>
       </w:r>
     </w:p>
     <w:p>
+      <w:pPr>
+        <w:jc w:val="both"/>
+      </w:pPr>
       <w:r>
         <w:t>On the other hand, blue layers may be used independently of folders during animation. This is notably used for pupils which can move by themselves, or eyelids which have masks and must therefore be moved by themselves.</w:t>
       </w:r>
-    </w:p>
-    <w:p>
-      <w:r>
-        <w:t>Some folders are labelled “--- Spine”. These are the main bones, meaning everything that moves along with it – for instance all the facial features moving with the head – are inside that folder. This simulates the bone system you might find in other animation softwares.</w:t>
+      <w:r>
+        <w:t xml:space="preserve"> If they are meant to have a mask, but it doesn’t work, check that the connection between the mask and the layer is off (there shouldn’t be a tick).</w:t>
+      </w:r>
+    </w:p>
+    <w:p>
+      <w:pPr>
+        <w:jc w:val="both"/>
+      </w:pPr>
+      <w:r>
+        <w:t xml:space="preserve">Some folders are labelled “--- Spine”. These are the main bones, meaning everything that moves along with it – for instance all the facial features moving with the head – are inside that folder. This simulates the bone system you might find in other animation </w:t>
+      </w:r>
+      <w:proofErr w:type="spellStart"/>
+      <w:r>
+        <w:t>softwares</w:t>
+      </w:r>
+      <w:proofErr w:type="spellEnd"/>
+      <w:r>
+        <w:t>.</w:t>
       </w:r>
     </w:p>
     <w:p>
       <w:pPr>
         <w:pStyle w:val="Titre2"/>
+        <w:jc w:val="both"/>
       </w:pPr>
       <w:r>
         <w:lastRenderedPageBreak/>
@@ -545,6 +697,9 @@
       </w:r>
     </w:p>
     <w:p>
+      <w:pPr>
+        <w:jc w:val="both"/>
+      </w:pPr>
       <w:r>
         <w:t>As explained above, the “create new timeline” button in the pink rectangle shouldn’t be used. Instead copy the blank template.</w:t>
       </w:r>
@@ -552,12 +707,16 @@
     <w:p>
       <w:pPr>
         <w:pStyle w:val="Titre2"/>
+        <w:jc w:val="both"/>
       </w:pPr>
       <w:r>
         <w:t>4 – Request assets from the Art Department</w:t>
       </w:r>
     </w:p>
     <w:p>
+      <w:pPr>
+        <w:jc w:val="both"/>
+      </w:pPr>
       <w:r>
         <w:t>If you need assets for your animation, like new hand poses or in-between frames for rapid animations, inform the art department so that they can create the new sprites necessary ASAP.</w:t>
       </w:r>
@@ -565,6 +724,7 @@
     <w:p>
       <w:pPr>
         <w:pStyle w:val="Titre1"/>
+        <w:jc w:val="both"/>
       </w:pPr>
       <w:r>
         <w:t>Animating</w:t>
@@ -573,12 +733,16 @@
     <w:p>
       <w:pPr>
         <w:pStyle w:val="Titre2"/>
+        <w:jc w:val="both"/>
       </w:pPr>
       <w:r>
         <w:t>1 – Creating and Duplicating Keyframes</w:t>
       </w:r>
     </w:p>
     <w:p>
+      <w:pPr>
+        <w:jc w:val="both"/>
+      </w:pPr>
       <w:r>
         <w:t xml:space="preserve">All actions, be it </w:t>
       </w:r>
@@ -590,6 +754,9 @@
       </w:r>
     </w:p>
     <w:p>
+      <w:pPr>
+        <w:jc w:val="both"/>
+      </w:pPr>
       <w:r>
         <w:rPr>
           <w:noProof/>
@@ -662,11 +829,17 @@
       </w:r>
     </w:p>
     <w:p>
+      <w:pPr>
+        <w:jc w:val="both"/>
+      </w:pPr>
       <w:r>
         <w:t>To duplicate existing frames, click and drag as if to move the frames but hold alt. A “+” icon will appear next to the ghost keyframe; this means it can be duplicated.</w:t>
       </w:r>
     </w:p>
     <w:p>
+      <w:pPr>
+        <w:jc w:val="both"/>
+      </w:pPr>
       <w:r>
         <w:t xml:space="preserve">If there are no keyframes yet – such as with a new asset added after animation had begun – do not create it manually. Instead, create it as if you were to be making a </w:t>
       </w:r>
@@ -675,8 +848,33 @@
           <w:i/>
           <w:iCs/>
         </w:rPr>
-        <w:t>Blank With PivotPoints</w:t>
-      </w:r>
+        <w:t xml:space="preserve">Blank </w:t>
+      </w:r>
+      <w:proofErr w:type="gramStart"/>
+      <w:r>
+        <w:rPr>
+          <w:i/>
+          <w:iCs/>
+        </w:rPr>
+        <w:t>With</w:t>
+      </w:r>
+      <w:proofErr w:type="gramEnd"/>
+      <w:r>
+        <w:rPr>
+          <w:i/>
+          <w:iCs/>
+        </w:rPr>
+        <w:t xml:space="preserve"> </w:t>
+      </w:r>
+      <w:proofErr w:type="spellStart"/>
+      <w:r>
+        <w:rPr>
+          <w:i/>
+          <w:iCs/>
+        </w:rPr>
+        <w:t>PivotPoints</w:t>
+      </w:r>
+      <w:proofErr w:type="spellEnd"/>
       <w:r>
         <w:t xml:space="preserve"> timeline, as per the guide below.</w:t>
       </w:r>
@@ -684,17 +882,24 @@
     <w:p>
       <w:pPr>
         <w:pStyle w:val="Titre2"/>
+        <w:jc w:val="both"/>
       </w:pPr>
       <w:r>
         <w:t>2 – Hiding Layers</w:t>
       </w:r>
     </w:p>
     <w:p>
+      <w:pPr>
+        <w:jc w:val="both"/>
+      </w:pPr>
       <w:r>
         <w:t>If you want to hide layers during the animation, you can’t simply use the eye icons next to the layers and folders.</w:t>
       </w:r>
     </w:p>
     <w:p>
+      <w:pPr>
+        <w:jc w:val="both"/>
+      </w:pPr>
       <w:r>
         <w:t>Instead,</w:t>
       </w:r>
@@ -703,11 +908,17 @@
       </w:r>
     </w:p>
     <w:p>
+      <w:pPr>
+        <w:jc w:val="both"/>
+      </w:pPr>
       <w:r>
         <w:t>Note that opacity has its own keyframes, which create small triangles instead of purple rhombuses, as seen in the image above in the Eye’s animation line.</w:t>
       </w:r>
     </w:p>
     <w:p>
+      <w:pPr>
+        <w:jc w:val="both"/>
+      </w:pPr>
       <w:r>
         <w:br w:type="page"/>
       </w:r>
@@ -715,6 +926,7 @@
     <w:p>
       <w:pPr>
         <w:pStyle w:val="Titre1"/>
+        <w:jc w:val="both"/>
       </w:pPr>
       <w:r>
         <w:lastRenderedPageBreak/>
@@ -725,11 +937,36 @@
           <w:i/>
           <w:iCs/>
         </w:rPr>
-        <w:t>Blank With PivotPoints</w:t>
-      </w:r>
-      <w:r>
+        <w:t xml:space="preserve">Blank </w:t>
+      </w:r>
+      <w:proofErr w:type="gramStart"/>
+      <w:r>
+        <w:rPr>
+          <w:i/>
+          <w:iCs/>
+        </w:rPr>
+        <w:t>With</w:t>
+      </w:r>
+      <w:proofErr w:type="gramEnd"/>
+      <w:r>
+        <w:rPr>
+          <w:i/>
+          <w:iCs/>
+        </w:rPr>
         <w:t xml:space="preserve"> </w:t>
       </w:r>
+      <w:proofErr w:type="spellStart"/>
+      <w:r>
+        <w:rPr>
+          <w:i/>
+          <w:iCs/>
+        </w:rPr>
+        <w:t>PivotPoints</w:t>
+      </w:r>
+      <w:proofErr w:type="spellEnd"/>
+      <w:r>
+        <w:t xml:space="preserve"> </w:t>
+      </w:r>
       <w:r>
         <w:t>T</w:t>
       </w:r>
@@ -740,12 +977,16 @@
     <w:p>
       <w:pPr>
         <w:pStyle w:val="Titre2"/>
+        <w:jc w:val="both"/>
       </w:pPr>
       <w:r>
         <w:t>1 – Create a New Timeline</w:t>
       </w:r>
     </w:p>
     <w:p>
+      <w:pPr>
+        <w:jc w:val="both"/>
+      </w:pPr>
       <w:r>
         <w:t xml:space="preserve">Start by creating a new timeline with the “Create Timeline” button and name it </w:t>
       </w:r>
@@ -754,8 +995,33 @@
           <w:i/>
           <w:iCs/>
         </w:rPr>
-        <w:t>Blank With PivotPoints</w:t>
-      </w:r>
+        <w:t xml:space="preserve">Blank </w:t>
+      </w:r>
+      <w:proofErr w:type="gramStart"/>
+      <w:r>
+        <w:rPr>
+          <w:i/>
+          <w:iCs/>
+        </w:rPr>
+        <w:t>With</w:t>
+      </w:r>
+      <w:proofErr w:type="gramEnd"/>
+      <w:r>
+        <w:rPr>
+          <w:i/>
+          <w:iCs/>
+        </w:rPr>
+        <w:t xml:space="preserve"> </w:t>
+      </w:r>
+      <w:proofErr w:type="spellStart"/>
+      <w:r>
+        <w:rPr>
+          <w:i/>
+          <w:iCs/>
+        </w:rPr>
+        <w:t>PivotPoints</w:t>
+      </w:r>
+      <w:proofErr w:type="spellEnd"/>
       <w:r>
         <w:t>.</w:t>
       </w:r>
@@ -763,39 +1029,56 @@
     <w:p>
       <w:pPr>
         <w:pStyle w:val="Titre2"/>
+        <w:jc w:val="both"/>
       </w:pPr>
       <w:r>
         <w:t>2 – Set up the Pivot Points</w:t>
       </w:r>
     </w:p>
     <w:p>
+      <w:pPr>
+        <w:jc w:val="both"/>
+      </w:pPr>
       <w:r>
         <w:t>This new timeline should not have any keyframes on it. Do not add any manually.</w:t>
       </w:r>
     </w:p>
     <w:p>
+      <w:pPr>
+        <w:jc w:val="both"/>
+      </w:pPr>
       <w:r>
         <w:t>Instead, select every relevant folder (non-red folders and blue layers) and set their pivot point. This is the small crosshair shown above in the dark blue rectangle.</w:t>
       </w:r>
     </w:p>
     <w:p>
+      <w:pPr>
+        <w:jc w:val="both"/>
+      </w:pPr>
       <w:r>
         <w:t>It is the point from which the animation rotates. The reason it must be set up before adding keyframes is because its position can also be manipulated by keyframes, so rotations would become inconsistent and difficult to control.</w:t>
       </w:r>
     </w:p>
     <w:p>
+      <w:pPr>
+        <w:jc w:val="both"/>
+      </w:pPr>
       <w:r>
         <w:t>Once all keyframes are created, select all frames, move them to frame 1 if not already there, then duplicate them to frame 24.</w:t>
       </w:r>
     </w:p>
     <w:p>
-      <w:r>
-        <w:t>To easily select all layers, click-and-drag + alt from a point on the screen that has no keyframes. This will create a selection area.</w:t>
+      <w:pPr>
+        <w:jc w:val="both"/>
+      </w:pPr>
+      <w:r>
+        <w:t>To easily select all layers, click-and-drag from a point on the screen that has no keyframes. This will create a selection area.</w:t>
       </w:r>
     </w:p>
     <w:p>
       <w:pPr>
         <w:pStyle w:val="Titre2"/>
+        <w:jc w:val="both"/>
       </w:pPr>
       <w:r>
         <w:t xml:space="preserve">3 – Duplicate the </w:t>
@@ -805,13 +1088,41 @@
           <w:i/>
           <w:iCs/>
         </w:rPr>
-        <w:t>Blank With PivotPoints</w:t>
-      </w:r>
+        <w:t xml:space="preserve">Blank </w:t>
+      </w:r>
+      <w:proofErr w:type="gramStart"/>
+      <w:r>
+        <w:rPr>
+          <w:i/>
+          <w:iCs/>
+        </w:rPr>
+        <w:t>With</w:t>
+      </w:r>
+      <w:proofErr w:type="gramEnd"/>
+      <w:r>
+        <w:rPr>
+          <w:i/>
+          <w:iCs/>
+        </w:rPr>
+        <w:t xml:space="preserve"> </w:t>
+      </w:r>
+      <w:proofErr w:type="spellStart"/>
+      <w:r>
+        <w:rPr>
+          <w:i/>
+          <w:iCs/>
+        </w:rPr>
+        <w:t>PivotPoints</w:t>
+      </w:r>
+      <w:proofErr w:type="spellEnd"/>
       <w:r>
         <w:t xml:space="preserve"> Timeline</w:t>
       </w:r>
     </w:p>
     <w:p>
+      <w:pPr>
+        <w:jc w:val="both"/>
+      </w:pPr>
       <w:r>
         <w:t>Don’t forget to duplicate the blank timeline before animating.</w:t>
       </w:r>

</xml_diff>